<commit_message>
Limita il documento alla sola parte atletica
Il blocco Palla di ogni seduta ora riporta solo tempo e vincoli di
carico (tetto salti, senza salto) da comunicare a chi conduce la
parte tecnica, senza contenuto tecnico-tattico: non è di competenza
di questo documento.

Co-Authored-By: Claude Sonnet 5 <noreply@anthropic.com>
Claude-Session: https://claude.ai/code/session_016ciRzDrgPy1vLaeuf5nDSf
</commit_message>
<xml_diff>
--- a/serie-d/settimana-2/Serie D - Settimana 2 - Allenamenti.docx
+++ b/serie-d/settimana-2/Serie D - Settimana 2 - Allenamenti.docx
@@ -54,8 +54,27 @@
       <w:r>
         <w:rPr>
           <w:rFonts w:ascii="Calibri" w:cs="Calibri" w:eastAsia="Calibri" w:hAnsi="Calibri"/>
+          <w:b/>
+          <w:bCs/>
         </w:rPr>
-        <w:t xml:space="preserve">Quattro sedute da due ore, come nella prima settimana. Su richiesta, ogni seduta è strutturata </w:t>
+        <w:t xml:space="preserve">Questo documento copre solo la parte atletica: </w:t>
+      </w:r>
+      <w:r>
+        <w:rPr>
+          <w:rFonts w:ascii="Calibri" w:cs="Calibri" w:eastAsia="Calibri" w:hAnsi="Calibri"/>
+        </w:rPr>
+        <w:t xml:space="preserve">riscaldamento, prevenzione, forza, salti, condizionamento. Il blocco "Palla" di ogni seduta è riportato solo come tempo e come vincoli di carico (tetto salti, senza salto) che chi conduce la parte tecnica deve rispettare per la tutela fisica delle atlete — il contenuto tecnico-tattico non è qui.</w:t>
+      </w:r>
+    </w:p>
+    <w:p>
+      <w:pPr>
+        <w:spacing w:after="120"/>
+      </w:pPr>
+      <w:r>
+        <w:rPr>
+          <w:rFonts w:ascii="Calibri" w:cs="Calibri" w:eastAsia="Calibri" w:hAnsi="Calibri"/>
+        </w:rPr>
+        <w:t xml:space="preserve">Quattro sedute da due ore, come nella prima settimana. Su richiesta, ogni seduta riserva </w:t>
       </w:r>
       <w:r>
         <w:rPr>
@@ -63,13 +82,13 @@
           <w:b/>
           <w:bCs/>
         </w:rPr>
-        <w:t xml:space="preserve">1h20 di palla e 40 minuti di lavoro fisico</w:t>
+        <w:t xml:space="preserve">40 minuti al lavoro fisico e 80 minuti alla palla</w:t>
       </w:r>
       <w:r>
         <w:rPr>
           <w:rFonts w:ascii="Calibri" w:cs="Calibri" w:eastAsia="Calibri" w:hAnsi="Calibri"/>
         </w:rPr>
-        <w:t xml:space="preserve"> (invece della proporzione originaria del piano, più sbilanciata sul fisico in questa settimana). I 22 minuti di riscaldamento e prevenzione restano intoccabili come da protocollo: sono i primi 22 dei 40 di fisico. I restanti 18 minuti di lavoro fisico specifico cambiano seduta per seduta, seguendo la stessa logica della settimana 2 del piano madre — entra il bilanciere, entra il primo vero lavoro di salto — solo compressa nel tempo. Il tempo guadagnato va tutto alla palla.</w:t>
+        <w:t xml:space="preserve"> (invece della proporzione originaria del piano, più sbilanciata sul fisico in questa settimana). I 22 minuti di riscaldamento e prevenzione restano intoccabili come da protocollo: sono i primi 22 dei 40 di fisico. I restanti 18 minuti di lavoro fisico specifico cambiano seduta per seduta, seguendo la stessa logica della settimana 2 del piano madre — entra il bilanciere, entra il primo vero lavoro di salto — solo compressa nel tempo.</w:t>
       </w:r>
     </w:p>
     <w:p>
@@ -790,7 +809,7 @@
                 <w:sz w:val="20"/>
                 <w:szCs w:val="20"/>
               </w:rPr>
-              <w:t xml:space="preserve">Condizionamento intermittente + gioco, nessuna misura del salto</w:t>
+              <w:t xml:space="preserve">Condizionamento intermittente, nessuna misura del salto</w:t>
             </w:r>
           </w:p>
         </w:tc>
@@ -1270,20 +1289,7 @@
                 <w:sz w:val="20"/>
                 <w:szCs w:val="20"/>
               </w:rPr>
-              <w:t xml:space="preserve">Primi 15': lavoro per ruolo dentro il gioco (spostato qui dal blocco fisico originario, è già tecnico-atletico) — centrali: spostamenti laterali lungo rete con arresto 6×10m + rinforzo peronei a coppie 2×15/lato; schiacciatrici/opposto: atterraggio dalla rincorsa senza palla 8 rip. curate + rotazioni esterne di spalla in frenata 3×10/lato; palleggiatrice: piegamenti con spinta finale delle scapole 3×12 + spostamenti brevi 6×5m; libero: tenute in posizione bassa, mobilità d'anca, frenate in tutte le direzioni, 6 rip.</w:t>
-            </w:r>
-          </w:p>
-          <w:p>
-            <w:pPr>
-              <w:spacing w:after="40"/>
-            </w:pPr>
-            <w:r>
-              <w:rPr>
-                <w:rFonts w:ascii="Calibri" w:cs="Calibri" w:eastAsia="Calibri" w:hAnsi="Calibri"/>
-                <w:sz w:val="20"/>
-                <w:szCs w:val="20"/>
-              </w:rPr>
-              <w:t xml:space="preserve">Restanti 65': ricezione e palleggio senza salto, prime costruzioni di gioco.</w:t>
+              <w:t xml:space="preserve">80', contenuto a cura dello staff tecnico. Vincolo di carico: senza salto — il lavoro di salto entra dalla 7ª seduta, qui la priorità è insegnare il gesto sotto bilanciere senza sommare altro stress da atterraggio.</w:t>
             </w:r>
           </w:p>
         </w:tc>
@@ -1767,7 +1773,7 @@
                 <w:sz w:val="20"/>
                 <w:szCs w:val="20"/>
               </w:rPr>
-              <w:t xml:space="preserve">Tecnica libera — palleggio, bagher, attacco, muro. Tetto salti: 65-75 a testa (60 se sono comparsi fastidi al ginocchio in settimana 1).</w:t>
+              <w:t xml:space="preserve">80', contenuto a cura dello staff tecnico. Vincolo di carico: tetto salti 65-75 a testa (60 se sono comparsi fastidi al ginocchio in settimana 1) — da monitorare e comunicare a chi conduce la seduta.</w:t>
             </w:r>
           </w:p>
         </w:tc>
@@ -2251,7 +2257,7 @@
                 <w:sz w:val="20"/>
                 <w:szCs w:val="20"/>
               </w:rPr>
-              <w:t xml:space="preserve">Ricezione, difesa, palleggio e situazioni di gioco. Salto molto limitato: il tetto della giornata è già stato impegnato nel blocco dedicato.</w:t>
+              <w:t xml:space="preserve">80', contenuto a cura dello staff tecnico. Vincolo di carico: salto molto limitato, il tetto della giornata (~40 contatti) è già stato impegnato nel blocco dedicato.</w:t>
             </w:r>
           </w:p>
         </w:tc>
@@ -2722,7 +2728,7 @@
                 <w:sz w:val="20"/>
                 <w:szCs w:val="20"/>
               </w:rPr>
-              <w:t xml:space="preserve">Gioco libero con salto. Da sommare al conteggio settimanale dei salti insieme alla seduta di giovedì e a quella di mercoledì, per restare dentro un incremento settimanale prudente rispetto alla settimana 1.</w:t>
+              <w:t xml:space="preserve">80', contenuto a cura dello staff tecnico. Vincolo di carico: i salti di questa seduta si sommano al conteggio settimanale insieme a quelli di mercoledì e giovedì, per restare dentro un incremento settimanale prudente rispetto alla settimana 1.</w:t>
             </w:r>
           </w:p>
         </w:tc>

</xml_diff>

<commit_message>
Correggi i giorni della settimana 2: lun/mer/gio/ven, non sabato
La 4a seduta passa da sabato 12/9 a venerdi 11/9. Segnalato che il
turnaround tra la seduta di salti (giovedi) e quella di
condizionamento (venerdi) scende sotto le 24 ore, contro i due giorni
della settimana 1, con indicazione di come tagliare volume se le
atlete arrivano indolenzite.

Co-Authored-By: Claude Sonnet 5 <noreply@anthropic.com>
Claude-Session: https://claude.ai/code/session_016ciRzDrgPy1vLaeuf5nDSf
</commit_message>
<xml_diff>
--- a/serie-d/settimana-2/Serie D - Settimana 2 - Allenamenti.docx
+++ b/serie-d/settimana-2/Serie D - Settimana 2 - Allenamenti.docx
@@ -734,7 +734,7 @@
                 <w:sz w:val="20"/>
                 <w:szCs w:val="20"/>
               </w:rPr>
-              <w:t xml:space="preserve">Sabato 12/9</w:t>
+              <w:t xml:space="preserve">Venerdì 11/9</w:t>
             </w:r>
           </w:p>
         </w:tc>
@@ -2300,7 +2300,7 @@
           <w:bCs/>
           <w:color w:val="1F3864"/>
         </w:rPr>
-        <w:t xml:space="preserve">8ª seduta — sabato 12 settembre — Condizionamento</w:t>
+        <w:t xml:space="preserve">8ª seduta — venerdì 11 settembre — Condizionamento</w:t>
       </w:r>
     </w:p>
     <w:p>
@@ -2313,7 +2313,7 @@
           <w:i/>
           <w:iCs/>
         </w:rPr>
-        <w:t xml:space="preserve">Chiude la settimana. Nessuna misura del salto (si torna a misurare tra qualche settimana, dopo qualche giorno leggero). Il circuito di forza-resistenza generale salta questa settimana per restare nei tempi: il richiamo metabolico specifico (intermittente) vale di più qui.</w:t>
+        <w:t xml:space="preserve">Chiude la settimana, a meno di 24 ore dalla 7ª (giovedì): niente più i due giorni di distanza della settimana 1 tra la seduta di salti e quella di condizionamento. L'indolenzimento da giovedì può essere ancora presente. Nessuna misura del salto (si torna a misurare tra qualche settimana, dopo qualche giorno leggero). Il circuito di forza-resistenza generale salta questa settimana per restare nei tempi: il richiamo metabolico specifico (intermittente) vale di più qui.</w:t>
       </w:r>
     </w:p>
     <w:tbl>
@@ -2652,6 +2652,19 @@
               <w:t xml:space="preserve">Rotazione: 1,3,5 — navetta 5-10-5; 2,4 — spostamenti laterali sui 5m; 6 — corsa lunga sui 20m.</w:t>
             </w:r>
           </w:p>
+          <w:p>
+            <w:pPr>
+              <w:spacing w:after="40"/>
+            </w:pPr>
+            <w:r>
+              <w:rPr>
+                <w:rFonts w:ascii="Calibri" w:cs="Calibri" w:eastAsia="Calibri" w:hAnsi="Calibri"/>
+                <w:sz w:val="20"/>
+                <w:szCs w:val="20"/>
+              </w:rPr>
+              <w:t xml:space="preserve">Chi arriva ancora indolenzita o con il ginocchio che cede all'interno negli arresti resta a 1 blocco da 6 invece di 2: qui conta più arrivare pulite a fine settimana che completare il volume.</w:t>
+            </w:r>
+          </w:p>
         </w:tc>
         <w:tc>
           <w:tcPr>
@@ -2789,6 +2802,25 @@
           <w:rFonts w:ascii="Calibri" w:cs="Calibri" w:eastAsia="Calibri" w:hAnsi="Calibri"/>
         </w:rPr>
         <w:t xml:space="preserve">Il piano madre prevedeva per la settimana 2 circa 120-140 salti totali e l'ingresso del bilanciere su due sedute (5ª e 7ª). Con la struttura compressa di questa settimana il bilanciere resta concentrato sulla sola 5ª seduta (più tempo, meno interruzioni, apprendimento del gesto più pulito), mentre il volume di salto resta entro lo stesso ordine di grandezza, distribuito tra 6ª, 7ª e 8ª. Vale comunque la regola di fondo: una differenza reale nel salto misurato si vede solo oltre i 2-3 centimetri, e la prima misura resta fissata alla 7ª seduta, a fresco, prima del blocco salti.</w:t>
+      </w:r>
+    </w:p>
+    <w:p>
+      <w:pPr>
+        <w:spacing w:after="120"/>
+      </w:pPr>
+      <w:r>
+        <w:rPr>
+          <w:rFonts w:ascii="Calibri" w:cs="Calibri" w:eastAsia="Calibri" w:hAnsi="Calibri"/>
+          <w:b/>
+          <w:bCs/>
+        </w:rPr>
+        <w:t xml:space="preserve">Nota sui giorni: </w:t>
+      </w:r>
+      <w:r>
+        <w:rPr>
+          <w:rFonts w:ascii="Calibri" w:cs="Calibri" w:eastAsia="Calibri" w:hAnsi="Calibri"/>
+        </w:rPr>
+        <w:t xml:space="preserve">questa settimana le sedute cadono lunedì, mercoledì, giovedì, venerdì — non lunedì/mercoledì/giovedì/sabato come nella settimana 1. Tra la 7ª (giovedì, primi salti) e l'8ª (venerdì, condizionamento) restano meno di 24 ore invece di due giorni pieni: è il punto più critico della settimana per il recupero, e nella seduta di venerdì è dove ho lasciato il margine per tagliare volume se serve.</w:t>
       </w:r>
     </w:p>
     <w:sectPr>

</xml_diff>